<commit_message>
docs(logbook): update DEVELOPMENT_LOG_CLOUD.docx with Purchase History module and Neon Cloud migration details
Co-authored-by: Antigravity AI <antigravity-agent@noreply.invalid>
</commit_message>
<xml_diff>
--- a/DEVELOPMENT_LOG_CLOUD.docx
+++ b/DEVELOPMENT_LOG_CLOUD.docx
@@ -1369,6 +1369,21 @@
     </w:tbl>
     <w:p/>
     <w:p>
+      <w:r>
+        <w:t>TDD Cycle 5: Purchase History &amp; Checkout Form Module (test_purchases.py &amp; purchase.test.jsx)</w:t>
+      </w:r>
+    </w:p>
+    <w:p>
+      <w:r>
+        <w:t>RED Phase: Written 3 backend unit tests (test_purchases.py) for order recording, user history isolation, and 401 guards. Written 3 frontend component tests (purchase.test.jsx) for PurchaseModal rendering, checkout form submit payload, and ProfileModal purchase history tab rendering.</w:t>
+      </w:r>
+    </w:p>
+    <w:p>
+      <w:r>
+        <w:t>GREEN &amp; REFACTOR Phase: Added purchase_history table to schema.sql with user_id, vehicle_id, quantity, price_at_purchase snapshot, buyer details, and index. Built PurchaseHistory model, Pydantic schemas, decoupled services/purchase.py service layer, updated POST /api/vehicles/{id}/purchase handler, created GET /api/purchases/me endpoint, built PurchaseModal.jsx checkout form, and added Purchase History tab in ProfileModal.jsx. Executed DDL migration on Neon Cloud PostgreSQL (neondb). All 36 full-stack tests passing.</w:t>
+      </w:r>
+    </w:p>
+    <w:p>
       <w:pPr>
         <w:pStyle w:val="Heading1"/>
       </w:pPr>
@@ -1387,6 +1402,8 @@
         <w:t>3. Deployed React 19 SPA frontend dashboard to Vercel (https://srs-dealership.vercel.app) configured with dynamic VITE_API_BASE_URL environment variable consumption (frontend/vercel.json).</w:t>
         <w:br/>
         <w:t>4. Empirical Verification: Verified 100% live cloud communication across Vercel frontend, Render FastAPI backend, and Neon PostgreSQL database.</w:t>
+        <w:br/>
+        <w:t>5. Executed purchase_history DDL migration in Neon Cloud PostgreSQL (neondb) establishing user_id/vehicle_id foreign keys, price_at_purchase snapshot column, buyer details, and index idx_purchase_history_user_id.</w:t>
       </w:r>
     </w:p>
     <w:tbl>
@@ -1597,16 +1614,16 @@
         <w:pStyle w:val="Heading1"/>
       </w:pPr>
       <w:r>
-        <w:t>6. Complete Empirical Test Summary (22/22 GREEN)</w:t>
+        <w:t>6. Complete Empirical Test Summary (36/36 GREEN)</w:t>
       </w:r>
     </w:p>
     <w:p>
       <w:r>
-        <w:t>Backend Pytest Suite: 18/18 PASSED (test_auth.py, test_vehicles.py, test_inventory.py)</w:t>
+        <w:t>Backend Pytest Suite: 21/21 PASSED (test_auth.py, test_vehicles.py, test_inventory.py, test_purchases.py)</w:t>
         <w:br/>
-        <w:t>Frontend Vitest Suite: 4/4 PASSED (App.test.jsx)</w:t>
+        <w:t>Frontend Vitest Suite: 15/15 PASSED (App.test.jsx, currency.test.js, sort.test.jsx, responsive.test.jsx, purchase.test.jsx)</w:t>
         <w:br/>
-        <w:t>Total Test Suite: 22/22 GREEN (Captured in backend_test_report.txt and frontend_test_report.txt)</w:t>
+        <w:t>Total Test Suite: 36/36 GREEN (Captured in backend_test_report.txt and frontend_test_report.txt)</w:t>
       </w:r>
     </w:p>
     <w:sectPr>

</xml_diff>